<commit_message>
Zastosuj zweryfikowane uwagi REVIEW i odtwórz eksporty książki
</commit_message>
<xml_diff>
--- a/templates/docx.docx
+++ b/templates/docx.docx
@@ -986,6 +986,17 @@
       <w:b w:val="0"/>
       <w:bCs w:val="0"/>
       <w:color w:val="365F91" w:themeColor="accent1" w:themeShade="BF"/>
+    </w:rPr>
+  </w:style>
+  <w:style w:type="paragraph" w:customStyle="1" w:styleId="CompactTable">
+    <w:name w:val="Compact Table"/>
+    <w:basedOn w:val="Compact"/>
+    <w:pPr>
+      <w:spacing w:before="36" w:after="36"/>
+    </w:pPr>
+    <w:rPr>
+      <w:sz w:val="18"/>
+      <w:szCs w:val="18"/>
     </w:rPr>
   </w:style>
 </w:styles>

</xml_diff>